<commit_message>
Add Lab 02 JS Interactivity
</commit_message>
<xml_diff>
--- a/Lab_02-JS-Interactivity/Lab_02_Report-232002-bsse6b.docx
+++ b/Lab_02-JS-Interactivity/Lab_02_Report-232002-bsse6b.docx
@@ -8,102 +8,379 @@
         <w:jc w:val="center"/>
       </w:pPr>
       <w:r>
-        <w:t>Lab 02 — Frontend Web Development (Interactivity) — JavaScript</w:t>
+        <w:t xml:space="preserve">Lab 02 — </w:t>
+      </w:r>
+      <w:r>
+        <w:rPr>
+          <w:lang w:val="en-US"/>
+        </w:rPr>
+        <w:t>Front-end</w:t>
+      </w:r>
+      <w:r>
+        <w:t xml:space="preserve"> Web Development (Interactivity) — JavaScript</w:t>
       </w:r>
     </w:p>
     <w:p>
       <w:pPr>
         <w:rPr>
           <w:rFonts w:hint="default"/>
+          <w:sz w:val="32"/>
+          <w:szCs w:val="32"/>
           <w:lang w:val="en-US"/>
         </w:rPr>
       </w:pPr>
       <w:r>
+        <w:rPr>
+          <w:sz w:val="32"/>
+          <w:szCs w:val="32"/>
+        </w:rPr>
         <w:t xml:space="preserve">Student: </w:t>
+      </w:r>
+      <w:r>
+        <w:rPr>
+          <w:rFonts w:hint="default"/>
+          <w:sz w:val="32"/>
+          <w:szCs w:val="32"/>
+          <w:lang w:val="en-US"/>
+        </w:rPr>
+        <w:t>Muhammad Sami</w:t>
+      </w:r>
+    </w:p>
+    <w:p>
+      <w:pPr>
+        <w:rPr>
+          <w:sz w:val="32"/>
+          <w:szCs w:val="32"/>
+        </w:rPr>
+      </w:pPr>
+      <w:r>
+        <w:rPr>
+          <w:sz w:val="32"/>
+          <w:szCs w:val="32"/>
+        </w:rPr>
+        <w:t xml:space="preserve">Repository URL: </w:t>
+      </w:r>
+      <w:r>
+        <w:rPr>
+          <w:rFonts w:hint="default"/>
+          <w:sz w:val="32"/>
+          <w:szCs w:val="32"/>
+        </w:rPr>
+        <w:t>https://github.com/Sami-Jhammat/Full-stack-programming-lab.git</w:t>
+      </w:r>
+      <w:bookmarkStart w:id="0" w:name="_GoBack"/>
+      <w:bookmarkEnd w:id="0"/>
+    </w:p>
+    <w:p>
+      <w:pPr>
+        <w:rPr>
+          <w:rFonts w:hint="default"/>
+          <w:sz w:val="32"/>
+          <w:szCs w:val="32"/>
+          <w:lang w:val="en-US"/>
+        </w:rPr>
+      </w:pPr>
+      <w:r>
+        <w:rPr>
+          <w:rFonts w:hint="default"/>
+          <w:sz w:val="32"/>
+          <w:szCs w:val="32"/>
+          <w:lang w:val="en-US"/>
+        </w:rPr>
+        <w:t>Class : BSSE 6B</w:t>
+      </w:r>
+    </w:p>
+    <w:p>
+      <w:pPr>
+        <w:rPr>
+          <w:rFonts w:hint="default"/>
+          <w:sz w:val="32"/>
+          <w:szCs w:val="32"/>
+          <w:lang w:val="en-US"/>
+        </w:rPr>
+      </w:pPr>
+      <w:r>
+        <w:rPr>
+          <w:rFonts w:hint="default"/>
+          <w:sz w:val="32"/>
+          <w:szCs w:val="32"/>
+          <w:lang w:val="en-US"/>
+        </w:rPr>
+        <w:t>Roll Number: 232002</w:t>
+      </w:r>
+    </w:p>
+    <w:p>
+      <w:pPr>
+        <w:pStyle w:val="2"/>
+      </w:pPr>
+    </w:p>
+    <w:p>
+      <w:pPr>
+        <w:pStyle w:val="2"/>
+        <w:rPr>
+          <w:rFonts w:hint="default"/>
+          <w:lang w:val="en-US"/>
+        </w:rPr>
+      </w:pPr>
+      <w:r>
+        <w:t>Task 1: Dynamic Qui</w:t>
       </w:r>
       <w:r>
         <w:rPr>
           <w:rFonts w:hint="default"/>
           <w:lang w:val="en-US"/>
         </w:rPr>
-        <w:t>Muhammad Sami</w:t>
-      </w:r>
-      <w:bookmarkStart w:id="0" w:name="_GoBack"/>
-      <w:bookmarkEnd w:id="0"/>
-    </w:p>
-    <w:p>
-      <w:r>
-        <w:t>Repository URL: ____________________</w:t>
+        <w:t>z</w:t>
       </w:r>
     </w:p>
     <w:p>
       <w:r>
-        <w:t>Folder: Lab_02-JS-Interactivity</w:t>
+        <w:drawing>
+          <wp:inline distT="0" distB="0" distL="114300" distR="114300">
+            <wp:extent cx="6847840" cy="6642735"/>
+            <wp:effectExtent l="0" t="0" r="10160" b="1905"/>
+            <wp:docPr id="1" name="Picture 1"/>
+            <wp:cNvGraphicFramePr>
+              <a:graphicFrameLocks xmlns:a="http://schemas.openxmlformats.org/drawingml/2006/main" noChangeAspect="1"/>
+            </wp:cNvGraphicFramePr>
+            <a:graphic xmlns:a="http://schemas.openxmlformats.org/drawingml/2006/main">
+              <a:graphicData uri="http://schemas.openxmlformats.org/drawingml/2006/picture">
+                <pic:pic xmlns:pic="http://schemas.openxmlformats.org/drawingml/2006/picture">
+                  <pic:nvPicPr>
+                    <pic:cNvPr id="1" name="Picture 1"/>
+                    <pic:cNvPicPr>
+                      <a:picLocks noChangeAspect="1"/>
+                    </pic:cNvPicPr>
+                  </pic:nvPicPr>
+                  <pic:blipFill>
+                    <a:blip r:embed="rId6"/>
+                    <a:stretch>
+                      <a:fillRect/>
+                    </a:stretch>
+                  </pic:blipFill>
+                  <pic:spPr>
+                    <a:xfrm>
+                      <a:off x="0" y="0"/>
+                      <a:ext cx="6847840" cy="6642735"/>
+                    </a:xfrm>
+                    <a:prstGeom prst="rect">
+                      <a:avLst/>
+                    </a:prstGeom>
+                    <a:noFill/>
+                    <a:ln>
+                      <a:noFill/>
+                    </a:ln>
+                  </pic:spPr>
+                </pic:pic>
+              </a:graphicData>
+            </a:graphic>
+          </wp:inline>
+        </w:drawing>
       </w:r>
     </w:p>
     <w:p>
       <w:r>
-        <w:t>Submission checklist: code screenshots + output screenshots for each task.</w:t>
+        <w:br w:type="textWrapping"/>
+      </w:r>
+      <w:r>
+        <w:drawing>
+          <wp:inline distT="0" distB="0" distL="114300" distR="114300">
+            <wp:extent cx="6857365" cy="7224395"/>
+            <wp:effectExtent l="0" t="0" r="635" b="14605"/>
+            <wp:docPr id="2" name="Picture 2"/>
+            <wp:cNvGraphicFramePr>
+              <a:graphicFrameLocks xmlns:a="http://schemas.openxmlformats.org/drawingml/2006/main" noChangeAspect="1"/>
+            </wp:cNvGraphicFramePr>
+            <a:graphic xmlns:a="http://schemas.openxmlformats.org/drawingml/2006/main">
+              <a:graphicData uri="http://schemas.openxmlformats.org/drawingml/2006/picture">
+                <pic:pic xmlns:pic="http://schemas.openxmlformats.org/drawingml/2006/picture">
+                  <pic:nvPicPr>
+                    <pic:cNvPr id="2" name="Picture 2"/>
+                    <pic:cNvPicPr>
+                      <a:picLocks noChangeAspect="1"/>
+                    </pic:cNvPicPr>
+                  </pic:nvPicPr>
+                  <pic:blipFill>
+                    <a:blip r:embed="rId7"/>
+                    <a:stretch>
+                      <a:fillRect/>
+                    </a:stretch>
+                  </pic:blipFill>
+                  <pic:spPr>
+                    <a:xfrm>
+                      <a:off x="0" y="0"/>
+                      <a:ext cx="6857365" cy="7224395"/>
+                    </a:xfrm>
+                    <a:prstGeom prst="rect">
+                      <a:avLst/>
+                    </a:prstGeom>
+                    <a:noFill/>
+                    <a:ln>
+                      <a:noFill/>
+                    </a:ln>
+                  </pic:spPr>
+                </pic:pic>
+              </a:graphicData>
+            </a:graphic>
+          </wp:inline>
+        </w:drawing>
+      </w:r>
+    </w:p>
+    <w:p>
+      <w:r>
+        <w:drawing>
+          <wp:inline distT="0" distB="0" distL="114300" distR="114300">
+            <wp:extent cx="6853555" cy="3568700"/>
+            <wp:effectExtent l="0" t="0" r="4445" b="12700"/>
+            <wp:docPr id="3" name="Picture 3"/>
+            <wp:cNvGraphicFramePr>
+              <a:graphicFrameLocks xmlns:a="http://schemas.openxmlformats.org/drawingml/2006/main" noChangeAspect="1"/>
+            </wp:cNvGraphicFramePr>
+            <a:graphic xmlns:a="http://schemas.openxmlformats.org/drawingml/2006/main">
+              <a:graphicData uri="http://schemas.openxmlformats.org/drawingml/2006/picture">
+                <pic:pic xmlns:pic="http://schemas.openxmlformats.org/drawingml/2006/picture">
+                  <pic:nvPicPr>
+                    <pic:cNvPr id="3" name="Picture 3"/>
+                    <pic:cNvPicPr>
+                      <a:picLocks noChangeAspect="1"/>
+                    </pic:cNvPicPr>
+                  </pic:nvPicPr>
+                  <pic:blipFill>
+                    <a:blip r:embed="rId8"/>
+                    <a:stretch>
+                      <a:fillRect/>
+                    </a:stretch>
+                  </pic:blipFill>
+                  <pic:spPr>
+                    <a:xfrm>
+                      <a:off x="0" y="0"/>
+                      <a:ext cx="6853555" cy="3568700"/>
+                    </a:xfrm>
+                    <a:prstGeom prst="rect">
+                      <a:avLst/>
+                    </a:prstGeom>
+                    <a:noFill/>
+                    <a:ln>
+                      <a:noFill/>
+                    </a:ln>
+                  </pic:spPr>
+                </pic:pic>
+              </a:graphicData>
+            </a:graphic>
+          </wp:inline>
+        </w:drawing>
       </w:r>
     </w:p>
     <w:p>
       <w:pPr>
-        <w:pStyle w:val="2"/>
+        <w:rPr>
+          <w:rFonts w:hint="default"/>
+          <w:b/>
+          <w:bCs/>
+          <w:lang w:val="en-US"/>
+        </w:rPr>
       </w:pPr>
       <w:r>
-        <w:t>Task 1: Dynamic Quiz</w:t>
+        <w:rPr>
+          <w:rFonts w:hint="default"/>
+          <w:b/>
+          <w:bCs/>
+          <w:lang w:val="en-US"/>
+        </w:rPr>
+        <w:t>OUTPUT:</w:t>
       </w:r>
     </w:p>
     <w:p>
       <w:r>
-        <w:t>Screenshots to add:</w:t>
+        <w:drawing>
+          <wp:inline distT="0" distB="0" distL="114300" distR="114300">
+            <wp:extent cx="6844665" cy="3791585"/>
+            <wp:effectExtent l="0" t="0" r="13335" b="3175"/>
+            <wp:docPr id="4" name="Picture 4"/>
+            <wp:cNvGraphicFramePr>
+              <a:graphicFrameLocks xmlns:a="http://schemas.openxmlformats.org/drawingml/2006/main" noChangeAspect="1"/>
+            </wp:cNvGraphicFramePr>
+            <a:graphic xmlns:a="http://schemas.openxmlformats.org/drawingml/2006/main">
+              <a:graphicData uri="http://schemas.openxmlformats.org/drawingml/2006/picture">
+                <pic:pic xmlns:pic="http://schemas.openxmlformats.org/drawingml/2006/picture">
+                  <pic:nvPicPr>
+                    <pic:cNvPr id="4" name="Picture 4"/>
+                    <pic:cNvPicPr>
+                      <a:picLocks noChangeAspect="1"/>
+                    </pic:cNvPicPr>
+                  </pic:nvPicPr>
+                  <pic:blipFill>
+                    <a:blip r:embed="rId9"/>
+                    <a:stretch>
+                      <a:fillRect/>
+                    </a:stretch>
+                  </pic:blipFill>
+                  <pic:spPr>
+                    <a:xfrm>
+                      <a:off x="0" y="0"/>
+                      <a:ext cx="6844665" cy="3791585"/>
+                    </a:xfrm>
+                    <a:prstGeom prst="rect">
+                      <a:avLst/>
+                    </a:prstGeom>
+                    <a:noFill/>
+                    <a:ln>
+                      <a:noFill/>
+                    </a:ln>
+                  </pic:spPr>
+                </pic:pic>
+              </a:graphicData>
+            </a:graphic>
+          </wp:inline>
+        </w:drawing>
       </w:r>
     </w:p>
     <w:p>
       <w:r>
-        <w:rPr>
-          <w:b w:val="0"/>
-        </w:rPr>
-        <w:t xml:space="preserve">• </w:t>
-      </w:r>
-      <w:r>
-        <w:t>Code screenshot(s)</w:t>
+        <w:drawing>
+          <wp:inline distT="0" distB="0" distL="114300" distR="114300">
+            <wp:extent cx="6847840" cy="3803650"/>
+            <wp:effectExtent l="0" t="0" r="10160" b="6350"/>
+            <wp:docPr id="5" name="Picture 5"/>
+            <wp:cNvGraphicFramePr>
+              <a:graphicFrameLocks xmlns:a="http://schemas.openxmlformats.org/drawingml/2006/main" noChangeAspect="1"/>
+            </wp:cNvGraphicFramePr>
+            <a:graphic xmlns:a="http://schemas.openxmlformats.org/drawingml/2006/main">
+              <a:graphicData uri="http://schemas.openxmlformats.org/drawingml/2006/picture">
+                <pic:pic xmlns:pic="http://schemas.openxmlformats.org/drawingml/2006/picture">
+                  <pic:nvPicPr>
+                    <pic:cNvPr id="5" name="Picture 5"/>
+                    <pic:cNvPicPr>
+                      <a:picLocks noChangeAspect="1"/>
+                    </pic:cNvPicPr>
+                  </pic:nvPicPr>
+                  <pic:blipFill>
+                    <a:blip r:embed="rId10"/>
+                    <a:stretch>
+                      <a:fillRect/>
+                    </a:stretch>
+                  </pic:blipFill>
+                  <pic:spPr>
+                    <a:xfrm>
+                      <a:off x="0" y="0"/>
+                      <a:ext cx="6847840" cy="3803650"/>
+                    </a:xfrm>
+                    <a:prstGeom prst="rect">
+                      <a:avLst/>
+                    </a:prstGeom>
+                    <a:noFill/>
+                    <a:ln>
+                      <a:noFill/>
+                    </a:ln>
+                  </pic:spPr>
+                </pic:pic>
+              </a:graphicData>
+            </a:graphic>
+          </wp:inline>
+        </w:drawing>
       </w:r>
       <w:r>
         <w:br w:type="textWrapping"/>
-      </w:r>
-    </w:p>
-    <w:p>
-      <w:r>
-        <w:t>• Browser output screenshot(s)</w:t>
-      </w:r>
-      <w:r>
-        <w:br w:type="textWrapping"/>
-      </w:r>
-    </w:p>
-    <w:p>
-      <w:r>
-        <w:t>Files:</w:t>
-      </w:r>
-    </w:p>
-    <w:p>
-      <w:r>
-        <w:t>- task1_quiz/index.html</w:t>
-      </w:r>
-    </w:p>
-    <w:p>
-      <w:r>
-        <w:t>- task1_quiz/style.css</w:t>
-      </w:r>
-    </w:p>
-    <w:p>
-      <w:r>
-        <w:t>- task1_quiz/script.js</w:t>
-      </w:r>
-    </w:p>
-    <w:p>
-      <w:r>
-        <w:t>Paste your screenshots below:</w:t>
       </w:r>
     </w:p>
     <w:p>
@@ -132,13 +409,47 @@
     </w:p>
     <w:p>
       <w:r>
-        <w:rPr>
-          <w:b w:val="0"/>
-        </w:rPr>
-        <w:t xml:space="preserve">• </w:t>
-      </w:r>
-      <w:r>
-        <w:t>Code screenshot(s)</w:t>
+        <w:drawing>
+          <wp:inline distT="0" distB="0" distL="114300" distR="114300">
+            <wp:extent cx="6854825" cy="7203440"/>
+            <wp:effectExtent l="0" t="0" r="3175" b="5080"/>
+            <wp:docPr id="6" name="Picture 6"/>
+            <wp:cNvGraphicFramePr>
+              <a:graphicFrameLocks xmlns:a="http://schemas.openxmlformats.org/drawingml/2006/main" noChangeAspect="1"/>
+            </wp:cNvGraphicFramePr>
+            <a:graphic xmlns:a="http://schemas.openxmlformats.org/drawingml/2006/main">
+              <a:graphicData uri="http://schemas.openxmlformats.org/drawingml/2006/picture">
+                <pic:pic xmlns:pic="http://schemas.openxmlformats.org/drawingml/2006/picture">
+                  <pic:nvPicPr>
+                    <pic:cNvPr id="6" name="Picture 6"/>
+                    <pic:cNvPicPr>
+                      <a:picLocks noChangeAspect="1"/>
+                    </pic:cNvPicPr>
+                  </pic:nvPicPr>
+                  <pic:blipFill>
+                    <a:blip r:embed="rId11"/>
+                    <a:stretch>
+                      <a:fillRect/>
+                    </a:stretch>
+                  </pic:blipFill>
+                  <pic:spPr>
+                    <a:xfrm>
+                      <a:off x="0" y="0"/>
+                      <a:ext cx="6854825" cy="7203440"/>
+                    </a:xfrm>
+                    <a:prstGeom prst="rect">
+                      <a:avLst/>
+                    </a:prstGeom>
+                    <a:noFill/>
+                    <a:ln>
+                      <a:noFill/>
+                    </a:ln>
+                  </pic:spPr>
+                </pic:pic>
+              </a:graphicData>
+            </a:graphic>
+          </wp:inline>
+        </w:drawing>
       </w:r>
       <w:r>
         <w:br w:type="textWrapping"/>
@@ -146,33 +457,93 @@
     </w:p>
     <w:p>
       <w:r>
-        <w:t>• Browser output screenshot(s)</w:t>
-      </w:r>
-      <w:r>
-        <w:br w:type="textWrapping"/>
+        <w:drawing>
+          <wp:inline distT="0" distB="0" distL="114300" distR="114300">
+            <wp:extent cx="6850380" cy="6369050"/>
+            <wp:effectExtent l="0" t="0" r="7620" b="1270"/>
+            <wp:docPr id="7" name="Picture 7"/>
+            <wp:cNvGraphicFramePr>
+              <a:graphicFrameLocks xmlns:a="http://schemas.openxmlformats.org/drawingml/2006/main" noChangeAspect="1"/>
+            </wp:cNvGraphicFramePr>
+            <a:graphic xmlns:a="http://schemas.openxmlformats.org/drawingml/2006/main">
+              <a:graphicData uri="http://schemas.openxmlformats.org/drawingml/2006/picture">
+                <pic:pic xmlns:pic="http://schemas.openxmlformats.org/drawingml/2006/picture">
+                  <pic:nvPicPr>
+                    <pic:cNvPr id="7" name="Picture 7"/>
+                    <pic:cNvPicPr>
+                      <a:picLocks noChangeAspect="1"/>
+                    </pic:cNvPicPr>
+                  </pic:nvPicPr>
+                  <pic:blipFill>
+                    <a:blip r:embed="rId12"/>
+                    <a:stretch>
+                      <a:fillRect/>
+                    </a:stretch>
+                  </pic:blipFill>
+                  <pic:spPr>
+                    <a:xfrm>
+                      <a:off x="0" y="0"/>
+                      <a:ext cx="6850380" cy="6369050"/>
+                    </a:xfrm>
+                    <a:prstGeom prst="rect">
+                      <a:avLst/>
+                    </a:prstGeom>
+                    <a:noFill/>
+                    <a:ln>
+                      <a:noFill/>
+                    </a:ln>
+                  </pic:spPr>
+                </pic:pic>
+              </a:graphicData>
+            </a:graphic>
+          </wp:inline>
+        </w:drawing>
       </w:r>
     </w:p>
     <w:p>
       <w:r>
-        <w:t>Files:</w:t>
+        <w:drawing>
+          <wp:inline distT="0" distB="0" distL="114300" distR="114300">
+            <wp:extent cx="6847840" cy="3282950"/>
+            <wp:effectExtent l="0" t="0" r="10160" b="8890"/>
+            <wp:docPr id="8" name="Picture 8"/>
+            <wp:cNvGraphicFramePr>
+              <a:graphicFrameLocks xmlns:a="http://schemas.openxmlformats.org/drawingml/2006/main" noChangeAspect="1"/>
+            </wp:cNvGraphicFramePr>
+            <a:graphic xmlns:a="http://schemas.openxmlformats.org/drawingml/2006/main">
+              <a:graphicData uri="http://schemas.openxmlformats.org/drawingml/2006/picture">
+                <pic:pic xmlns:pic="http://schemas.openxmlformats.org/drawingml/2006/picture">
+                  <pic:nvPicPr>
+                    <pic:cNvPr id="8" name="Picture 8"/>
+                    <pic:cNvPicPr>
+                      <a:picLocks noChangeAspect="1"/>
+                    </pic:cNvPicPr>
+                  </pic:nvPicPr>
+                  <pic:blipFill>
+                    <a:blip r:embed="rId13"/>
+                    <a:stretch>
+                      <a:fillRect/>
+                    </a:stretch>
+                  </pic:blipFill>
+                  <pic:spPr>
+                    <a:xfrm>
+                      <a:off x="0" y="0"/>
+                      <a:ext cx="6847840" cy="3282950"/>
+                    </a:xfrm>
+                    <a:prstGeom prst="rect">
+                      <a:avLst/>
+                    </a:prstGeom>
+                    <a:noFill/>
+                    <a:ln>
+                      <a:noFill/>
+                    </a:ln>
+                  </pic:spPr>
+                </pic:pic>
+              </a:graphicData>
+            </a:graphic>
+          </wp:inline>
+        </w:drawing>
       </w:r>
-    </w:p>
-    <w:p>
-      <w:r>
-        <w:t>- task2_calculator/index.html</w:t>
-      </w:r>
-    </w:p>
-    <w:p>
-      <w:r>
-        <w:t>- task2_calculator/script.js</w:t>
-      </w:r>
-    </w:p>
-    <w:p>
-      <w:r>
-        <w:t>Paste your screenshots below:</w:t>
-      </w:r>
-    </w:p>
-    <w:p>
       <w:r>
         <w:br w:type="textWrapping"/>
       </w:r>
@@ -193,62 +564,141 @@
     </w:p>
     <w:p>
       <w:r>
-        <w:t>Screenshots to add:</w:t>
+        <w:drawing>
+          <wp:inline distT="0" distB="0" distL="114300" distR="114300">
+            <wp:extent cx="6849745" cy="5948045"/>
+            <wp:effectExtent l="0" t="0" r="8255" b="10795"/>
+            <wp:docPr id="9" name="Picture 9"/>
+            <wp:cNvGraphicFramePr>
+              <a:graphicFrameLocks xmlns:a="http://schemas.openxmlformats.org/drawingml/2006/main" noChangeAspect="1"/>
+            </wp:cNvGraphicFramePr>
+            <a:graphic xmlns:a="http://schemas.openxmlformats.org/drawingml/2006/main">
+              <a:graphicData uri="http://schemas.openxmlformats.org/drawingml/2006/picture">
+                <pic:pic xmlns:pic="http://schemas.openxmlformats.org/drawingml/2006/picture">
+                  <pic:nvPicPr>
+                    <pic:cNvPr id="9" name="Picture 9"/>
+                    <pic:cNvPicPr>
+                      <a:picLocks noChangeAspect="1"/>
+                    </pic:cNvPicPr>
+                  </pic:nvPicPr>
+                  <pic:blipFill>
+                    <a:blip r:embed="rId14"/>
+                    <a:stretch>
+                      <a:fillRect/>
+                    </a:stretch>
+                  </pic:blipFill>
+                  <pic:spPr>
+                    <a:xfrm>
+                      <a:off x="0" y="0"/>
+                      <a:ext cx="6849745" cy="5948045"/>
+                    </a:xfrm>
+                    <a:prstGeom prst="rect">
+                      <a:avLst/>
+                    </a:prstGeom>
+                    <a:noFill/>
+                    <a:ln>
+                      <a:noFill/>
+                    </a:ln>
+                  </pic:spPr>
+                </pic:pic>
+              </a:graphicData>
+            </a:graphic>
+          </wp:inline>
+        </w:drawing>
       </w:r>
     </w:p>
     <w:p>
       <w:r>
-        <w:rPr>
-          <w:b w:val="0"/>
-        </w:rPr>
-        <w:t xml:space="preserve">• </w:t>
+        <w:drawing>
+          <wp:inline distT="0" distB="0" distL="114300" distR="114300">
+            <wp:extent cx="6855460" cy="6206490"/>
+            <wp:effectExtent l="0" t="0" r="2540" b="11430"/>
+            <wp:docPr id="10" name="Picture 10"/>
+            <wp:cNvGraphicFramePr>
+              <a:graphicFrameLocks xmlns:a="http://schemas.openxmlformats.org/drawingml/2006/main" noChangeAspect="1"/>
+            </wp:cNvGraphicFramePr>
+            <a:graphic xmlns:a="http://schemas.openxmlformats.org/drawingml/2006/main">
+              <a:graphicData uri="http://schemas.openxmlformats.org/drawingml/2006/picture">
+                <pic:pic xmlns:pic="http://schemas.openxmlformats.org/drawingml/2006/picture">
+                  <pic:nvPicPr>
+                    <pic:cNvPr id="10" name="Picture 10"/>
+                    <pic:cNvPicPr>
+                      <a:picLocks noChangeAspect="1"/>
+                    </pic:cNvPicPr>
+                  </pic:nvPicPr>
+                  <pic:blipFill>
+                    <a:blip r:embed="rId15"/>
+                    <a:stretch>
+                      <a:fillRect/>
+                    </a:stretch>
+                  </pic:blipFill>
+                  <pic:spPr>
+                    <a:xfrm>
+                      <a:off x="0" y="0"/>
+                      <a:ext cx="6855460" cy="6206490"/>
+                    </a:xfrm>
+                    <a:prstGeom prst="rect">
+                      <a:avLst/>
+                    </a:prstGeom>
+                    <a:noFill/>
+                    <a:ln>
+                      <a:noFill/>
+                    </a:ln>
+                  </pic:spPr>
+                </pic:pic>
+              </a:graphicData>
+            </a:graphic>
+          </wp:inline>
+        </w:drawing>
       </w:r>
-      <w:r>
-        <w:t>Code screenshot(s)</w:t>
-      </w:r>
-      <w:r>
-        <w:br w:type="textWrapping"/>
-      </w:r>
-    </w:p>
-    <w:p>
-      <w:r>
-        <w:t>• Browser output screenshot(s)</w:t>
-      </w:r>
-      <w:r>
-        <w:br w:type="textWrapping"/>
-      </w:r>
-    </w:p>
-    <w:p>
-      <w:r>
-        <w:t>Files:</w:t>
-      </w:r>
-    </w:p>
-    <w:p>
-      <w:r>
-        <w:t>- task3_todo/index.html</w:t>
-      </w:r>
-    </w:p>
-    <w:p>
-      <w:r>
-        <w:t>- task3_todo/style.css</w:t>
-      </w:r>
-    </w:p>
-    <w:p>
-      <w:r>
-        <w:t>- task3_todo/script.js</w:t>
-      </w:r>
-    </w:p>
-    <w:p>
-      <w:r>
-        <w:t>Paste your screenshots below:</w:t>
-      </w:r>
-    </w:p>
-    <w:p>
       <w:r>
         <w:br w:type="textWrapping"/>
       </w:r>
       <w:r>
         <w:br w:type="textWrapping"/>
+      </w:r>
+      <w:r>
+        <w:drawing>
+          <wp:inline distT="0" distB="0" distL="114300" distR="114300">
+            <wp:extent cx="6850380" cy="3061335"/>
+            <wp:effectExtent l="0" t="0" r="7620" b="1905"/>
+            <wp:docPr id="11" name="Picture 11"/>
+            <wp:cNvGraphicFramePr>
+              <a:graphicFrameLocks xmlns:a="http://schemas.openxmlformats.org/drawingml/2006/main" noChangeAspect="1"/>
+            </wp:cNvGraphicFramePr>
+            <a:graphic xmlns:a="http://schemas.openxmlformats.org/drawingml/2006/main">
+              <a:graphicData uri="http://schemas.openxmlformats.org/drawingml/2006/picture">
+                <pic:pic xmlns:pic="http://schemas.openxmlformats.org/drawingml/2006/picture">
+                  <pic:nvPicPr>
+                    <pic:cNvPr id="11" name="Picture 11"/>
+                    <pic:cNvPicPr>
+                      <a:picLocks noChangeAspect="1"/>
+                    </pic:cNvPicPr>
+                  </pic:nvPicPr>
+                  <pic:blipFill>
+                    <a:blip r:embed="rId16"/>
+                    <a:stretch>
+                      <a:fillRect/>
+                    </a:stretch>
+                  </pic:blipFill>
+                  <pic:spPr>
+                    <a:xfrm>
+                      <a:off x="0" y="0"/>
+                      <a:ext cx="6850380" cy="3061335"/>
+                    </a:xfrm>
+                    <a:prstGeom prst="rect">
+                      <a:avLst/>
+                    </a:prstGeom>
+                    <a:noFill/>
+                    <a:ln>
+                      <a:noFill/>
+                    </a:ln>
+                  </pic:spPr>
+                </pic:pic>
+              </a:graphicData>
+            </a:graphic>
+          </wp:inline>
+        </w:drawing>
       </w:r>
       <w:r>
         <w:br w:type="textWrapping"/>
@@ -264,62 +714,141 @@
     </w:p>
     <w:p>
       <w:r>
-        <w:t>Screenshots to add:</w:t>
+        <w:drawing>
+          <wp:inline distT="0" distB="0" distL="114300" distR="114300">
+            <wp:extent cx="6853555" cy="7343140"/>
+            <wp:effectExtent l="0" t="0" r="4445" b="2540"/>
+            <wp:docPr id="12" name="Picture 12"/>
+            <wp:cNvGraphicFramePr>
+              <a:graphicFrameLocks xmlns:a="http://schemas.openxmlformats.org/drawingml/2006/main" noChangeAspect="1"/>
+            </wp:cNvGraphicFramePr>
+            <a:graphic xmlns:a="http://schemas.openxmlformats.org/drawingml/2006/main">
+              <a:graphicData uri="http://schemas.openxmlformats.org/drawingml/2006/picture">
+                <pic:pic xmlns:pic="http://schemas.openxmlformats.org/drawingml/2006/picture">
+                  <pic:nvPicPr>
+                    <pic:cNvPr id="12" name="Picture 12"/>
+                    <pic:cNvPicPr>
+                      <a:picLocks noChangeAspect="1"/>
+                    </pic:cNvPicPr>
+                  </pic:nvPicPr>
+                  <pic:blipFill>
+                    <a:blip r:embed="rId17"/>
+                    <a:stretch>
+                      <a:fillRect/>
+                    </a:stretch>
+                  </pic:blipFill>
+                  <pic:spPr>
+                    <a:xfrm>
+                      <a:off x="0" y="0"/>
+                      <a:ext cx="6853555" cy="7343140"/>
+                    </a:xfrm>
+                    <a:prstGeom prst="rect">
+                      <a:avLst/>
+                    </a:prstGeom>
+                    <a:noFill/>
+                    <a:ln>
+                      <a:noFill/>
+                    </a:ln>
+                  </pic:spPr>
+                </pic:pic>
+              </a:graphicData>
+            </a:graphic>
+          </wp:inline>
+        </w:drawing>
       </w:r>
     </w:p>
     <w:p>
       <w:r>
-        <w:rPr>
-          <w:b w:val="0"/>
-        </w:rPr>
-        <w:t xml:space="preserve">• </w:t>
+        <w:drawing>
+          <wp:inline distT="0" distB="0" distL="114300" distR="114300">
+            <wp:extent cx="6858000" cy="6510655"/>
+            <wp:effectExtent l="0" t="0" r="0" b="12065"/>
+            <wp:docPr id="13" name="Picture 13"/>
+            <wp:cNvGraphicFramePr>
+              <a:graphicFrameLocks xmlns:a="http://schemas.openxmlformats.org/drawingml/2006/main" noChangeAspect="1"/>
+            </wp:cNvGraphicFramePr>
+            <a:graphic xmlns:a="http://schemas.openxmlformats.org/drawingml/2006/main">
+              <a:graphicData uri="http://schemas.openxmlformats.org/drawingml/2006/picture">
+                <pic:pic xmlns:pic="http://schemas.openxmlformats.org/drawingml/2006/picture">
+                  <pic:nvPicPr>
+                    <pic:cNvPr id="13" name="Picture 13"/>
+                    <pic:cNvPicPr>
+                      <a:picLocks noChangeAspect="1"/>
+                    </pic:cNvPicPr>
+                  </pic:nvPicPr>
+                  <pic:blipFill>
+                    <a:blip r:embed="rId18"/>
+                    <a:stretch>
+                      <a:fillRect/>
+                    </a:stretch>
+                  </pic:blipFill>
+                  <pic:spPr>
+                    <a:xfrm>
+                      <a:off x="0" y="0"/>
+                      <a:ext cx="6858000" cy="6510655"/>
+                    </a:xfrm>
+                    <a:prstGeom prst="rect">
+                      <a:avLst/>
+                    </a:prstGeom>
+                    <a:noFill/>
+                    <a:ln>
+                      <a:noFill/>
+                    </a:ln>
+                  </pic:spPr>
+                </pic:pic>
+              </a:graphicData>
+            </a:graphic>
+          </wp:inline>
+        </w:drawing>
       </w:r>
-      <w:r>
-        <w:t>Code screenshot(s)</w:t>
-      </w:r>
-      <w:r>
-        <w:br w:type="textWrapping"/>
-      </w:r>
-    </w:p>
-    <w:p>
-      <w:r>
-        <w:t>• Browser output screenshot(s)</w:t>
-      </w:r>
-      <w:r>
-        <w:br w:type="textWrapping"/>
-      </w:r>
-    </w:p>
-    <w:p>
-      <w:r>
-        <w:t>Files:</w:t>
-      </w:r>
-    </w:p>
-    <w:p>
-      <w:r>
-        <w:t>- task4_colorbox/index.html</w:t>
-      </w:r>
-    </w:p>
-    <w:p>
-      <w:r>
-        <w:t>- task4_colorbox/style.css</w:t>
-      </w:r>
-    </w:p>
-    <w:p>
-      <w:r>
-        <w:t>- task4_colorbox/script.js</w:t>
-      </w:r>
-    </w:p>
-    <w:p>
-      <w:r>
-        <w:t>Paste your screenshots below:</w:t>
-      </w:r>
-    </w:p>
-    <w:p>
       <w:r>
         <w:br w:type="textWrapping"/>
       </w:r>
       <w:r>
         <w:br w:type="textWrapping"/>
+      </w:r>
+      <w:r>
+        <w:drawing>
+          <wp:inline distT="0" distB="0" distL="114300" distR="114300">
+            <wp:extent cx="6855460" cy="4143375"/>
+            <wp:effectExtent l="0" t="0" r="2540" b="1905"/>
+            <wp:docPr id="14" name="Picture 14"/>
+            <wp:cNvGraphicFramePr>
+              <a:graphicFrameLocks xmlns:a="http://schemas.openxmlformats.org/drawingml/2006/main" noChangeAspect="1"/>
+            </wp:cNvGraphicFramePr>
+            <a:graphic xmlns:a="http://schemas.openxmlformats.org/drawingml/2006/main">
+              <a:graphicData uri="http://schemas.openxmlformats.org/drawingml/2006/picture">
+                <pic:pic xmlns:pic="http://schemas.openxmlformats.org/drawingml/2006/picture">
+                  <pic:nvPicPr>
+                    <pic:cNvPr id="14" name="Picture 14"/>
+                    <pic:cNvPicPr>
+                      <a:picLocks noChangeAspect="1"/>
+                    </pic:cNvPicPr>
+                  </pic:nvPicPr>
+                  <pic:blipFill>
+                    <a:blip r:embed="rId19"/>
+                    <a:stretch>
+                      <a:fillRect/>
+                    </a:stretch>
+                  </pic:blipFill>
+                  <pic:spPr>
+                    <a:xfrm>
+                      <a:off x="0" y="0"/>
+                      <a:ext cx="6855460" cy="4143375"/>
+                    </a:xfrm>
+                    <a:prstGeom prst="rect">
+                      <a:avLst/>
+                    </a:prstGeom>
+                    <a:noFill/>
+                    <a:ln>
+                      <a:noFill/>
+                    </a:ln>
+                  </pic:spPr>
+                </pic:pic>
+              </a:graphicData>
+            </a:graphic>
+          </wp:inline>
+        </w:drawing>
       </w:r>
       <w:r>
         <w:br w:type="textWrapping"/>
@@ -335,78 +864,199 @@
     </w:p>
     <w:p>
       <w:r>
-        <w:t>Screenshots to add:</w:t>
+        <w:drawing>
+          <wp:inline distT="0" distB="0" distL="114300" distR="114300">
+            <wp:extent cx="6851015" cy="5128260"/>
+            <wp:effectExtent l="0" t="0" r="6985" b="7620"/>
+            <wp:docPr id="15" name="Picture 15"/>
+            <wp:cNvGraphicFramePr>
+              <a:graphicFrameLocks xmlns:a="http://schemas.openxmlformats.org/drawingml/2006/main" noChangeAspect="1"/>
+            </wp:cNvGraphicFramePr>
+            <a:graphic xmlns:a="http://schemas.openxmlformats.org/drawingml/2006/main">
+              <a:graphicData uri="http://schemas.openxmlformats.org/drawingml/2006/picture">
+                <pic:pic xmlns:pic="http://schemas.openxmlformats.org/drawingml/2006/picture">
+                  <pic:nvPicPr>
+                    <pic:cNvPr id="15" name="Picture 15"/>
+                    <pic:cNvPicPr>
+                      <a:picLocks noChangeAspect="1"/>
+                    </pic:cNvPicPr>
+                  </pic:nvPicPr>
+                  <pic:blipFill>
+                    <a:blip r:embed="rId20"/>
+                    <a:stretch>
+                      <a:fillRect/>
+                    </a:stretch>
+                  </pic:blipFill>
+                  <pic:spPr>
+                    <a:xfrm>
+                      <a:off x="0" y="0"/>
+                      <a:ext cx="6851015" cy="5128260"/>
+                    </a:xfrm>
+                    <a:prstGeom prst="rect">
+                      <a:avLst/>
+                    </a:prstGeom>
+                    <a:noFill/>
+                    <a:ln>
+                      <a:noFill/>
+                    </a:ln>
+                  </pic:spPr>
+                </pic:pic>
+              </a:graphicData>
+            </a:graphic>
+          </wp:inline>
+        </w:drawing>
       </w:r>
     </w:p>
     <w:p>
       <w:r>
-        <w:rPr>
-          <w:b w:val="0"/>
-        </w:rPr>
-        <w:t xml:space="preserve">• </w:t>
-      </w:r>
-      <w:r>
-        <w:t>Code screenshot(s)</w:t>
-      </w:r>
-      <w:r>
-        <w:br w:type="textWrapping"/>
+        <w:drawing>
+          <wp:inline distT="0" distB="0" distL="114300" distR="114300">
+            <wp:extent cx="6847205" cy="5931535"/>
+            <wp:effectExtent l="0" t="0" r="10795" b="12065"/>
+            <wp:docPr id="16" name="Picture 16"/>
+            <wp:cNvGraphicFramePr>
+              <a:graphicFrameLocks xmlns:a="http://schemas.openxmlformats.org/drawingml/2006/main" noChangeAspect="1"/>
+            </wp:cNvGraphicFramePr>
+            <a:graphic xmlns:a="http://schemas.openxmlformats.org/drawingml/2006/main">
+              <a:graphicData uri="http://schemas.openxmlformats.org/drawingml/2006/picture">
+                <pic:pic xmlns:pic="http://schemas.openxmlformats.org/drawingml/2006/picture">
+                  <pic:nvPicPr>
+                    <pic:cNvPr id="16" name="Picture 16"/>
+                    <pic:cNvPicPr>
+                      <a:picLocks noChangeAspect="1"/>
+                    </pic:cNvPicPr>
+                  </pic:nvPicPr>
+                  <pic:blipFill>
+                    <a:blip r:embed="rId21"/>
+                    <a:stretch>
+                      <a:fillRect/>
+                    </a:stretch>
+                  </pic:blipFill>
+                  <pic:spPr>
+                    <a:xfrm>
+                      <a:off x="0" y="0"/>
+                      <a:ext cx="6847205" cy="5931535"/>
+                    </a:xfrm>
+                    <a:prstGeom prst="rect">
+                      <a:avLst/>
+                    </a:prstGeom>
+                    <a:noFill/>
+                    <a:ln>
+                      <a:noFill/>
+                    </a:ln>
+                  </pic:spPr>
+                </pic:pic>
+              </a:graphicData>
+            </a:graphic>
+          </wp:inline>
+        </w:drawing>
       </w:r>
     </w:p>
     <w:p>
       <w:r>
-        <w:t>• Browser output screenshot(s)</w:t>
+        <w:drawing>
+          <wp:inline distT="0" distB="0" distL="114300" distR="114300">
+            <wp:extent cx="5076825" cy="2181225"/>
+            <wp:effectExtent l="0" t="0" r="13335" b="13335"/>
+            <wp:docPr id="17" name="Picture 17"/>
+            <wp:cNvGraphicFramePr>
+              <a:graphicFrameLocks xmlns:a="http://schemas.openxmlformats.org/drawingml/2006/main" noChangeAspect="1"/>
+            </wp:cNvGraphicFramePr>
+            <a:graphic xmlns:a="http://schemas.openxmlformats.org/drawingml/2006/main">
+              <a:graphicData uri="http://schemas.openxmlformats.org/drawingml/2006/picture">
+                <pic:pic xmlns:pic="http://schemas.openxmlformats.org/drawingml/2006/picture">
+                  <pic:nvPicPr>
+                    <pic:cNvPr id="17" name="Picture 17"/>
+                    <pic:cNvPicPr>
+                      <a:picLocks noChangeAspect="1"/>
+                    </pic:cNvPicPr>
+                  </pic:nvPicPr>
+                  <pic:blipFill>
+                    <a:blip r:embed="rId22"/>
+                    <a:stretch>
+                      <a:fillRect/>
+                    </a:stretch>
+                  </pic:blipFill>
+                  <pic:spPr>
+                    <a:xfrm>
+                      <a:off x="0" y="0"/>
+                      <a:ext cx="5076825" cy="2181225"/>
+                    </a:xfrm>
+                    <a:prstGeom prst="rect">
+                      <a:avLst/>
+                    </a:prstGeom>
+                    <a:noFill/>
+                    <a:ln>
+                      <a:noFill/>
+                    </a:ln>
+                  </pic:spPr>
+                </pic:pic>
+              </a:graphicData>
+            </a:graphic>
+          </wp:inline>
+        </w:drawing>
       </w:r>
+    </w:p>
+    <w:p/>
+    <w:p/>
+    <w:p>
+      <w:pPr>
+        <w:rPr>
+          <w:rFonts w:hint="default"/>
+          <w:lang w:val="en-US"/>
+        </w:rPr>
+      </w:pPr>
       <w:r>
-        <w:br w:type="textWrapping"/>
+        <w:rPr>
+          <w:rFonts w:hint="default"/>
+          <w:lang w:val="en-US"/>
+        </w:rPr>
+        <w:t>Output:</w:t>
       </w:r>
     </w:p>
     <w:p>
       <w:r>
-        <w:t>Files:</w:t>
-      </w:r>
-    </w:p>
-    <w:p>
-      <w:r>
-        <w:t>- task5_form_validation/index.html</w:t>
-      </w:r>
-    </w:p>
-    <w:p>
-      <w:r>
-        <w:t>- task5_form_validation/style.css</w:t>
-      </w:r>
-    </w:p>
-    <w:p>
-      <w:r>
-        <w:t>- task5_form_validation/script.js</w:t>
-      </w:r>
-    </w:p>
-    <w:p>
-      <w:r>
-        <w:t>Paste your screenshots below:</w:t>
-      </w:r>
-    </w:p>
-    <w:p>
-      <w:r>
-        <w:br w:type="textWrapping"/>
-      </w:r>
-      <w:r>
-        <w:br w:type="textWrapping"/>
-      </w:r>
-      <w:r>
-        <w:br w:type="textWrapping"/>
-      </w:r>
-    </w:p>
-    <w:p>
-      <w:pPr>
-        <w:pStyle w:val="2"/>
-      </w:pPr>
-      <w:r>
-        <w:t>Code (copy/paste for record)</w:t>
-      </w:r>
-    </w:p>
-    <w:p>
-      <w:r>
-        <w:t>Optional: paste key code snippets here, or attach screenshots only.</w:t>
+        <w:drawing>
+          <wp:inline distT="0" distB="0" distL="114300" distR="114300">
+            <wp:extent cx="6845300" cy="3473450"/>
+            <wp:effectExtent l="0" t="0" r="12700" b="1270"/>
+            <wp:docPr id="18" name="Picture 18"/>
+            <wp:cNvGraphicFramePr>
+              <a:graphicFrameLocks xmlns:a="http://schemas.openxmlformats.org/drawingml/2006/main" noChangeAspect="1"/>
+            </wp:cNvGraphicFramePr>
+            <a:graphic xmlns:a="http://schemas.openxmlformats.org/drawingml/2006/main">
+              <a:graphicData uri="http://schemas.openxmlformats.org/drawingml/2006/picture">
+                <pic:pic xmlns:pic="http://schemas.openxmlformats.org/drawingml/2006/picture">
+                  <pic:nvPicPr>
+                    <pic:cNvPr id="18" name="Picture 18"/>
+                    <pic:cNvPicPr>
+                      <a:picLocks noChangeAspect="1"/>
+                    </pic:cNvPicPr>
+                  </pic:nvPicPr>
+                  <pic:blipFill>
+                    <a:blip r:embed="rId23"/>
+                    <a:stretch>
+                      <a:fillRect/>
+                    </a:stretch>
+                  </pic:blipFill>
+                  <pic:spPr>
+                    <a:xfrm>
+                      <a:off x="0" y="0"/>
+                      <a:ext cx="6845300" cy="3473450"/>
+                    </a:xfrm>
+                    <a:prstGeom prst="rect">
+                      <a:avLst/>
+                    </a:prstGeom>
+                    <a:noFill/>
+                    <a:ln>
+                      <a:noFill/>
+                    </a:ln>
+                  </pic:spPr>
+                </pic:pic>
+              </a:graphicData>
+            </a:graphic>
+          </wp:inline>
+        </w:drawing>
       </w:r>
     </w:p>
     <w:sectPr>
@@ -823,9 +1473,9 @@
     <w:lsdException w:unhideWhenUsed="0" w:uiPriority="72" w:semiHidden="0" w:name="Colorful List Accent 2"/>
     <w:lsdException w:unhideWhenUsed="0" w:uiPriority="73" w:semiHidden="0" w:name="Colorful Grid Accent 2"/>
     <w:lsdException w:qFormat="1" w:unhideWhenUsed="0" w:uiPriority="60" w:semiHidden="0" w:name="Light Shading Accent 3"/>
-    <w:lsdException w:unhideWhenUsed="0" w:uiPriority="61" w:semiHidden="0" w:name="Light List Accent 3"/>
+    <w:lsdException w:qFormat="1" w:unhideWhenUsed="0" w:uiPriority="61" w:semiHidden="0" w:name="Light List Accent 3"/>
     <w:lsdException w:unhideWhenUsed="0" w:uiPriority="62" w:semiHidden="0" w:name="Light Grid Accent 3"/>
-    <w:lsdException w:unhideWhenUsed="0" w:uiPriority="63" w:semiHidden="0" w:name="Medium Shading 1 Accent 3"/>
+    <w:lsdException w:qFormat="1" w:unhideWhenUsed="0" w:uiPriority="63" w:semiHidden="0" w:name="Medium Shading 1 Accent 3"/>
     <w:lsdException w:unhideWhenUsed="0" w:uiPriority="64" w:semiHidden="0" w:name="Medium Shading 2 Accent 3"/>
     <w:lsdException w:unhideWhenUsed="0" w:uiPriority="65" w:semiHidden="0" w:name="Medium List 1 Accent 3"/>
     <w:lsdException w:qFormat="1" w:unhideWhenUsed="0" w:uiPriority="66" w:semiHidden="0" w:name="Medium List 2 Accent 3"/>
@@ -852,7 +1502,7 @@
     <w:lsdException w:unhideWhenUsed="0" w:uiPriority="73" w:semiHidden="0" w:name="Colorful Grid Accent 4"/>
     <w:lsdException w:qFormat="1" w:unhideWhenUsed="0" w:uiPriority="60" w:semiHidden="0" w:name="Light Shading Accent 5"/>
     <w:lsdException w:unhideWhenUsed="0" w:uiPriority="61" w:semiHidden="0" w:name="Light List Accent 5"/>
-    <w:lsdException w:unhideWhenUsed="0" w:uiPriority="62" w:semiHidden="0" w:name="Light Grid Accent 5"/>
+    <w:lsdException w:qFormat="1" w:unhideWhenUsed="0" w:uiPriority="62" w:semiHidden="0" w:name="Light Grid Accent 5"/>
     <w:lsdException w:unhideWhenUsed="0" w:uiPriority="63" w:semiHidden="0" w:name="Medium Shading 1 Accent 5"/>
     <w:lsdException w:unhideWhenUsed="0" w:uiPriority="64" w:semiHidden="0" w:name="Medium Shading 2 Accent 5"/>
     <w:lsdException w:unhideWhenUsed="0" w:uiPriority="65" w:semiHidden="0" w:name="Medium List 1 Accent 5"/>
@@ -866,7 +1516,7 @@
     <w:lsdException w:unhideWhenUsed="0" w:uiPriority="73" w:semiHidden="0" w:name="Colorful Grid Accent 5"/>
     <w:lsdException w:qFormat="1" w:unhideWhenUsed="0" w:uiPriority="60" w:semiHidden="0" w:name="Light Shading Accent 6"/>
     <w:lsdException w:unhideWhenUsed="0" w:uiPriority="61" w:semiHidden="0" w:name="Light List Accent 6"/>
-    <w:lsdException w:unhideWhenUsed="0" w:uiPriority="62" w:semiHidden="0" w:name="Light Grid Accent 6"/>
+    <w:lsdException w:qFormat="1" w:unhideWhenUsed="0" w:uiPriority="62" w:semiHidden="0" w:name="Light Grid Accent 6"/>
     <w:lsdException w:unhideWhenUsed="0" w:uiPriority="63" w:semiHidden="0" w:name="Medium Shading 1 Accent 6"/>
     <w:lsdException w:unhideWhenUsed="0" w:uiPriority="64" w:semiHidden="0" w:name="Medium Shading 2 Accent 6"/>
     <w:lsdException w:unhideWhenUsed="0" w:uiPriority="65" w:semiHidden="0" w:name="Medium List 1 Accent 6"/>
@@ -2489,6 +3139,7 @@
   <w:style w:type="table" w:styleId="47">
     <w:name w:val="Light List Accent 3"/>
     <w:basedOn w:val="12"/>
+    <w:qFormat/>
     <w:uiPriority w:val="61"/>
     <w:pPr>
       <w:spacing w:after="0" w:line="240" w:lineRule="auto"/>
@@ -3491,6 +4142,7 @@
   <w:style w:type="table" w:styleId="56">
     <w:name w:val="Light Grid Accent 5"/>
     <w:basedOn w:val="12"/>
+    <w:qFormat/>
     <w:uiPriority w:val="62"/>
     <w:pPr>
       <w:spacing w:after="0" w:line="240" w:lineRule="auto"/>
@@ -3617,6 +4269,7 @@
   <w:style w:type="table" w:styleId="57">
     <w:name w:val="Light Grid Accent 6"/>
     <w:basedOn w:val="12"/>
+    <w:qFormat/>
     <w:uiPriority w:val="62"/>
     <w:pPr>
       <w:spacing w:after="0" w:line="240" w:lineRule="auto"/>
@@ -4064,6 +4717,7 @@
   <w:style w:type="table" w:styleId="61">
     <w:name w:val="Medium Shading 1 Accent 3"/>
     <w:basedOn w:val="12"/>
+    <w:qFormat/>
     <w:uiPriority w:val="63"/>
     <w:pPr>
       <w:spacing w:after="0" w:line="240" w:lineRule="auto"/>

</xml_diff>